<commit_message>
docs: handoff v2cy — 10-year plan phrase sync to docx/md; archive v2cx
Co-Authored-By: Claude Fable 5 <noreply@anthropic.com>
</commit_message>
<xml_diff>
--- a/reports/사역소개서,이력서,신앙간증문,사역계획서/MFH-사역계획서-2026-2036-양식.docx
+++ b/reports/사역소개서,이력서,신앙간증문,사역계획서/MFH-사역계획서-2026-2036-양식.docx
@@ -1312,7 +1312,7 @@
         <w:rPr>
           <w:color w:val="000000"/>
         </w:rPr>
-        <w:t>)는 이 건축이다 — 공간이 서야 예배가 서고, 예배가 서야 다음 세대가 자란다.</w:t>
+        <w:t>)는 이 건축이다 — 예배는 이미 마당에서 드려지고 있다. 이 공간은 그 예배가 뿌리내릴 터전이 되고, 그 터전에서 다음 세대가 자란다.</w:t>
       </w:r>
     </w:p>
     <w:p>
@@ -3164,7 +3164,7 @@
         <w:rPr>
           <w:color w:val="000000"/>
         </w:rPr>
-        <w:t>공간이 서면 사람이 자라고, 사람이 자라면 자립 교회가 선다.</w:t>
+        <w:t>마당에서 시작된 사역이 터전을 얻고(짓다), 그 터전에서 사람이 자라며(기르다), 자란 사람에게 사역을 맡긴다(맡기다).</w:t>
       </w:r>
     </w:p>
     <w:p>

</xml_diff>